<commit_message>
Panduan Word: tambah bab 12 tentang penyebaran ke platform lain
Bab baru memuat peta platform (GitHub Pages, Vercel, Netlify, Cloudflare Pages, Firebase Hosting,
Hugging Face Spaces) beserta artinya bagi header keamanan, alasan penyimpanan peladen (Supabase,
Firestore, D1, R2, KV) sengaja tidak disambungkan, dan catatan WebView2 untuk berkas jalankan
desktop. Entri daftar isi ditambahkan. Berkas divalidasi terhadap skema OOXML: 860 menjadi 899
paragraf, tanpa kesalahan.

Co-Authored-By: Claude Sonnet 5.5 <noreply@anthropic.com>
Claude-Session: https://claude.ai/code/session_01L79WEcHaeBqDCBmhkVHdqL
</commit_message>
<xml_diff>
--- a/dokumen/Panduan-Manual-MetriKa.docx
+++ b/dokumen/Panduan-Manual-MetriKa.docx
@@ -434,6 +434,32 @@
           <w:szCs w:val="22"/>
         </w:rPr>
         <w:t xml:space="preserve">	Pemecahan masalah</w:t>
+      </w:r>
+    </w:p>
+    <w:p>
+      <w:pPr>
+        <w:tabs>
+          <w:tab w:val="left" w:pos="700"/>
+        </w:tabs>
+        <w:spacing w:after="110"/>
+      </w:pPr>
+      <w:r>
+        <w:rPr>
+          <w:rFonts w:ascii="Times New Roman" w:cs="Times New Roman" w:eastAsia="Times New Roman" w:hAnsi="Times New Roman"/>
+          <w:b/>
+          <w:bCs/>
+          <w:sz w:val="22"/>
+          <w:szCs w:val="22"/>
+        </w:rPr>
+        <w:t xml:space="preserve">12</w:t>
+      </w:r>
+      <w:r>
+        <w:rPr>
+          <w:rFonts w:ascii="Times New Roman" w:cs="Times New Roman" w:eastAsia="Times New Roman" w:hAnsi="Times New Roman"/>
+          <w:sz w:val="22"/>
+          <w:szCs w:val="22"/>
+        </w:rPr>
+        <w:t xml:space="preserve">	Penyebaran ke platform lain</w:t>
       </w:r>
     </w:p>
     <w:p>
@@ -16722,6 +16748,1034 @@
         </w:tc>
       </w:tr>
     </w:tbl>
+    <w:p>
+      <w:pPr>
+        <w:pStyle w:val="Heading1"/>
+      </w:pPr>
+      <w:r>
+        <w:rPr>
+          <w:rFonts w:ascii="Times New Roman" w:cs="Times New Roman" w:eastAsia="Times New Roman" w:hAnsi="Times New Roman"/>
+        </w:rPr>
+        <w:t xml:space="preserve">12. Penyebaran ke platform lain</w:t>
+      </w:r>
+    </w:p>
+    <w:p>
+      <w:pPr>
+        <w:spacing w:after="100" w:line="252"/>
+        <w:jc w:val="both"/>
+      </w:pPr>
+      <w:r>
+        <w:rPr>
+          <w:rFonts w:ascii="Times New Roman" w:cs="Times New Roman" w:eastAsia="Times New Roman" w:hAnsi="Times New Roman"/>
+          <w:sz w:val="22"/>
+          <w:szCs w:val="22"/>
+        </w:rPr>
+        <w:t xml:space="preserve">MetriKa adalah aplikasi statis: satu folder berisi HTML, JavaScript, gaya, dan dua berkas kecil. Karena itu menyebarkannya ke platform hosting mana pun cukup dengan menyajikan folder docs/ hasil pembangunan. Perintahnya sama di semua tempat: pnpm install --frozen-lockfile, lalu pnpm --filter @metrika/app run build. Berkas hasil codegen sudah ada di repositori, sehingga tidak perlu dijalankan lagi.</w:t>
+      </w:r>
+    </w:p>
+    <w:tbl>
+      <w:tblPr>
+        <w:tblW w:type="dxa" w:w="9072"/>
+        <w:tblBorders>
+          <w:top w:val="single" w:color="auto" w:sz="4"/>
+          <w:left w:val="single" w:color="auto" w:sz="4"/>
+          <w:bottom w:val="single" w:color="auto" w:sz="4"/>
+          <w:right w:val="single" w:color="auto" w:sz="4"/>
+          <w:insideH w:val="single" w:color="auto" w:sz="4"/>
+          <w:insideV w:val="single" w:color="auto" w:sz="4"/>
+        </w:tblBorders>
+      </w:tblPr>
+      <w:tblGrid>
+        <w:gridCol w:w="2500"/>
+        <w:gridCol w:w="3700"/>
+        <w:gridCol w:w="1500"/>
+        <w:gridCol w:w="1372"/>
+      </w:tblGrid>
+      <w:tr>
+        <w:trPr>
+          <w:tblHeader/>
+        </w:trPr>
+        <w:tc>
+          <w:tcPr>
+            <w:tcW w:type="dxa" w:w="2500"/>
+            <w:tcBorders>
+              <w:top w:val="single" w:color="808080" w:sz="4"/>
+              <w:left w:val="single" w:color="808080" w:sz="4"/>
+              <w:bottom w:val="single" w:color="808080" w:sz="4"/>
+              <w:right w:val="single" w:color="808080" w:sz="4"/>
+            </w:tcBorders>
+            <w:shd w:fill="D9D9D9" w:val="clear"/>
+            <w:tcMar>
+              <w:top w:type="dxa" w:w="35"/>
+              <w:left w:type="dxa" w:w="90"/>
+              <w:bottom w:type="dxa" w:w="35"/>
+              <w:right w:type="dxa" w:w="90"/>
+            </w:tcMar>
+          </w:tcPr>
+          <w:p>
+            <w:pPr>
+              <w:spacing w:after="40" w:line="260"/>
+            </w:pPr>
+            <w:r>
+              <w:rPr>
+                <w:rFonts w:ascii="Times New Roman" w:cs="Times New Roman" w:eastAsia="Times New Roman" w:hAnsi="Times New Roman"/>
+                <w:b/>
+                <w:bCs/>
+                <w:sz w:val="19"/>
+                <w:szCs w:val="19"/>
+              </w:rPr>
+              <w:t xml:space="preserve">Platform</w:t>
+            </w:r>
+          </w:p>
+        </w:tc>
+        <w:tc>
+          <w:tcPr>
+            <w:tcW w:type="dxa" w:w="3700"/>
+            <w:tcBorders>
+              <w:top w:val="single" w:color="808080" w:sz="4"/>
+              <w:left w:val="single" w:color="808080" w:sz="4"/>
+              <w:bottom w:val="single" w:color="808080" w:sz="4"/>
+              <w:right w:val="single" w:color="808080" w:sz="4"/>
+            </w:tcBorders>
+            <w:shd w:fill="D9D9D9" w:val="clear"/>
+            <w:tcMar>
+              <w:top w:type="dxa" w:w="35"/>
+              <w:left w:type="dxa" w:w="90"/>
+              <w:bottom w:type="dxa" w:w="35"/>
+              <w:right w:type="dxa" w:w="90"/>
+            </w:tcMar>
+          </w:tcPr>
+          <w:p>
+            <w:pPr>
+              <w:spacing w:after="40" w:line="260"/>
+            </w:pPr>
+            <w:r>
+              <w:rPr>
+                <w:rFonts w:ascii="Times New Roman" w:cs="Times New Roman" w:eastAsia="Times New Roman" w:hAnsi="Times New Roman"/>
+                <w:b/>
+                <w:bCs/>
+                <w:sz w:val="19"/>
+                <w:szCs w:val="19"/>
+              </w:rPr>
+              <w:t xml:space="preserve">Berkas konfigurasi</w:t>
+            </w:r>
+          </w:p>
+        </w:tc>
+        <w:tc>
+          <w:tcPr>
+            <w:tcW w:type="dxa" w:w="1500"/>
+            <w:tcBorders>
+              <w:top w:val="single" w:color="808080" w:sz="4"/>
+              <w:left w:val="single" w:color="808080" w:sz="4"/>
+              <w:bottom w:val="single" w:color="808080" w:sz="4"/>
+              <w:right w:val="single" w:color="808080" w:sz="4"/>
+            </w:tcBorders>
+            <w:shd w:fill="D9D9D9" w:val="clear"/>
+            <w:tcMar>
+              <w:top w:type="dxa" w:w="35"/>
+              <w:left w:type="dxa" w:w="90"/>
+              <w:bottom w:type="dxa" w:w="35"/>
+              <w:right w:type="dxa" w:w="90"/>
+            </w:tcMar>
+          </w:tcPr>
+          <w:p>
+            <w:pPr>
+              <w:spacing w:after="40" w:line="260"/>
+            </w:pPr>
+            <w:r>
+              <w:rPr>
+                <w:rFonts w:ascii="Times New Roman" w:cs="Times New Roman" w:eastAsia="Times New Roman" w:hAnsi="Times New Roman"/>
+                <w:b/>
+                <w:bCs/>
+                <w:sz w:val="19"/>
+                <w:szCs w:val="19"/>
+              </w:rPr>
+              <w:t xml:space="preserve">Header nyata</w:t>
+            </w:r>
+          </w:p>
+        </w:tc>
+        <w:tc>
+          <w:tcPr>
+            <w:tcW w:type="dxa" w:w="1372"/>
+            <w:tcBorders>
+              <w:top w:val="single" w:color="808080" w:sz="4"/>
+              <w:left w:val="single" w:color="808080" w:sz="4"/>
+              <w:bottom w:val="single" w:color="808080" w:sz="4"/>
+              <w:right w:val="single" w:color="808080" w:sz="4"/>
+            </w:tcBorders>
+            <w:shd w:fill="D9D9D9" w:val="clear"/>
+            <w:tcMar>
+              <w:top w:type="dxa" w:w="35"/>
+              <w:left w:type="dxa" w:w="90"/>
+              <w:bottom w:type="dxa" w:w="35"/>
+              <w:right w:type="dxa" w:w="90"/>
+            </w:tcMar>
+          </w:tcPr>
+          <w:p>
+            <w:pPr>
+              <w:spacing w:after="40" w:line="260"/>
+            </w:pPr>
+            <w:r>
+              <w:rPr>
+                <w:rFonts w:ascii="Times New Roman" w:cs="Times New Roman" w:eastAsia="Times New Roman" w:hAnsi="Times New Roman"/>
+                <w:b/>
+                <w:bCs/>
+                <w:sz w:val="19"/>
+                <w:szCs w:val="19"/>
+              </w:rPr>
+              <w:t xml:space="preserve">Biaya</w:t>
+            </w:r>
+          </w:p>
+        </w:tc>
+      </w:tr>
+      <w:tr>
+        <w:trPr>
+          <w:cantSplit/>
+        </w:trPr>
+        <w:tc>
+          <w:tcPr>
+            <w:tcW w:type="dxa" w:w="2500"/>
+            <w:tcBorders>
+              <w:top w:val="single" w:color="808080" w:sz="4"/>
+              <w:left w:val="single" w:color="808080" w:sz="4"/>
+              <w:bottom w:val="single" w:color="808080" w:sz="4"/>
+              <w:right w:val="single" w:color="808080" w:sz="4"/>
+            </w:tcBorders>
+            <w:tcMar>
+              <w:top w:type="dxa" w:w="35"/>
+              <w:left w:type="dxa" w:w="90"/>
+              <w:bottom w:type="dxa" w:w="35"/>
+              <w:right w:type="dxa" w:w="90"/>
+            </w:tcMar>
+          </w:tcPr>
+          <w:p>
+            <w:pPr>
+              <w:spacing w:after="40" w:line="260"/>
+            </w:pPr>
+            <w:r>
+              <w:rPr>
+                <w:rFonts w:ascii="Times New Roman" w:cs="Times New Roman" w:eastAsia="Times New Roman" w:hAnsi="Times New Roman"/>
+                <w:sz w:val="19"/>
+                <w:szCs w:val="19"/>
+              </w:rPr>
+              <w:t xml:space="preserve">GitHub Pages (berjalan)</w:t>
+            </w:r>
+          </w:p>
+        </w:tc>
+        <w:tc>
+          <w:tcPr>
+            <w:tcW w:type="dxa" w:w="3700"/>
+            <w:tcBorders>
+              <w:top w:val="single" w:color="808080" w:sz="4"/>
+              <w:left w:val="single" w:color="808080" w:sz="4"/>
+              <w:bottom w:val="single" w:color="808080" w:sz="4"/>
+              <w:right w:val="single" w:color="808080" w:sz="4"/>
+            </w:tcBorders>
+            <w:tcMar>
+              <w:top w:type="dxa" w:w="35"/>
+              <w:left w:type="dxa" w:w="90"/>
+              <w:bottom w:type="dxa" w:w="35"/>
+              <w:right w:type="dxa" w:w="90"/>
+            </w:tcMar>
+          </w:tcPr>
+          <w:p>
+            <w:pPr>
+              <w:spacing w:after="40" w:line="260"/>
+            </w:pPr>
+            <w:r>
+              <w:rPr>
+                <w:rFonts w:ascii="Times New Roman" w:cs="Times New Roman" w:eastAsia="Times New Roman" w:hAnsi="Times New Roman"/>
+                <w:sz w:val="19"/>
+                <w:szCs w:val="19"/>
+              </w:rPr>
+              <w:t xml:space="preserve">.github/workflows/pages.yml</w:t>
+            </w:r>
+          </w:p>
+        </w:tc>
+        <w:tc>
+          <w:tcPr>
+            <w:tcW w:type="dxa" w:w="1500"/>
+            <w:tcBorders>
+              <w:top w:val="single" w:color="808080" w:sz="4"/>
+              <w:left w:val="single" w:color="808080" w:sz="4"/>
+              <w:bottom w:val="single" w:color="808080" w:sz="4"/>
+              <w:right w:val="single" w:color="808080" w:sz="4"/>
+            </w:tcBorders>
+            <w:tcMar>
+              <w:top w:type="dxa" w:w="35"/>
+              <w:left w:type="dxa" w:w="90"/>
+              <w:bottom w:type="dxa" w:w="35"/>
+              <w:right w:type="dxa" w:w="90"/>
+            </w:tcMar>
+          </w:tcPr>
+          <w:p>
+            <w:pPr>
+              <w:spacing w:after="40" w:line="260"/>
+            </w:pPr>
+            <w:r>
+              <w:rPr>
+                <w:rFonts w:ascii="Times New Roman" w:cs="Times New Roman" w:eastAsia="Times New Roman" w:hAnsi="Times New Roman"/>
+                <w:sz w:val="19"/>
+                <w:szCs w:val="19"/>
+              </w:rPr>
+              <w:t xml:space="preserve">Tidak</w:t>
+            </w:r>
+          </w:p>
+        </w:tc>
+        <w:tc>
+          <w:tcPr>
+            <w:tcW w:type="dxa" w:w="1372"/>
+            <w:tcBorders>
+              <w:top w:val="single" w:color="808080" w:sz="4"/>
+              <w:left w:val="single" w:color="808080" w:sz="4"/>
+              <w:bottom w:val="single" w:color="808080" w:sz="4"/>
+              <w:right w:val="single" w:color="808080" w:sz="4"/>
+            </w:tcBorders>
+            <w:tcMar>
+              <w:top w:type="dxa" w:w="35"/>
+              <w:left w:type="dxa" w:w="90"/>
+              <w:bottom w:type="dxa" w:w="35"/>
+              <w:right w:type="dxa" w:w="90"/>
+            </w:tcMar>
+          </w:tcPr>
+          <w:p>
+            <w:pPr>
+              <w:spacing w:after="40" w:line="260"/>
+            </w:pPr>
+            <w:r>
+              <w:rPr>
+                <w:rFonts w:ascii="Times New Roman" w:cs="Times New Roman" w:eastAsia="Times New Roman" w:hAnsi="Times New Roman"/>
+                <w:sz w:val="19"/>
+                <w:szCs w:val="19"/>
+              </w:rPr>
+              <w:t xml:space="preserve">Gratis</w:t>
+            </w:r>
+          </w:p>
+        </w:tc>
+      </w:tr>
+      <w:tr>
+        <w:trPr>
+          <w:cantSplit/>
+        </w:trPr>
+        <w:tc>
+          <w:tcPr>
+            <w:tcW w:type="dxa" w:w="2500"/>
+            <w:tcBorders>
+              <w:top w:val="single" w:color="808080" w:sz="4"/>
+              <w:left w:val="single" w:color="808080" w:sz="4"/>
+              <w:bottom w:val="single" w:color="808080" w:sz="4"/>
+              <w:right w:val="single" w:color="808080" w:sz="4"/>
+            </w:tcBorders>
+            <w:tcMar>
+              <w:top w:type="dxa" w:w="35"/>
+              <w:left w:type="dxa" w:w="90"/>
+              <w:bottom w:type="dxa" w:w="35"/>
+              <w:right w:type="dxa" w:w="90"/>
+            </w:tcMar>
+          </w:tcPr>
+          <w:p>
+            <w:pPr>
+              <w:spacing w:after="40" w:line="260"/>
+            </w:pPr>
+            <w:r>
+              <w:rPr>
+                <w:rFonts w:ascii="Times New Roman" w:cs="Times New Roman" w:eastAsia="Times New Roman" w:hAnsi="Times New Roman"/>
+                <w:sz w:val="19"/>
+                <w:szCs w:val="19"/>
+              </w:rPr>
+              <w:t xml:space="preserve">Vercel</w:t>
+            </w:r>
+          </w:p>
+        </w:tc>
+        <w:tc>
+          <w:tcPr>
+            <w:tcW w:type="dxa" w:w="3700"/>
+            <w:tcBorders>
+              <w:top w:val="single" w:color="808080" w:sz="4"/>
+              <w:left w:val="single" w:color="808080" w:sz="4"/>
+              <w:bottom w:val="single" w:color="808080" w:sz="4"/>
+              <w:right w:val="single" w:color="808080" w:sz="4"/>
+            </w:tcBorders>
+            <w:tcMar>
+              <w:top w:type="dxa" w:w="35"/>
+              <w:left w:type="dxa" w:w="90"/>
+              <w:bottom w:type="dxa" w:w="35"/>
+              <w:right w:type="dxa" w:w="90"/>
+            </w:tcMar>
+          </w:tcPr>
+          <w:p>
+            <w:pPr>
+              <w:spacing w:after="40" w:line="260"/>
+            </w:pPr>
+            <w:r>
+              <w:rPr>
+                <w:rFonts w:ascii="Times New Roman" w:cs="Times New Roman" w:eastAsia="Times New Roman" w:hAnsi="Times New Roman"/>
+                <w:sz w:val="19"/>
+                <w:szCs w:val="19"/>
+              </w:rPr>
+              <w:t xml:space="preserve">vercel.json</w:t>
+            </w:r>
+          </w:p>
+        </w:tc>
+        <w:tc>
+          <w:tcPr>
+            <w:tcW w:type="dxa" w:w="1500"/>
+            <w:tcBorders>
+              <w:top w:val="single" w:color="808080" w:sz="4"/>
+              <w:left w:val="single" w:color="808080" w:sz="4"/>
+              <w:bottom w:val="single" w:color="808080" w:sz="4"/>
+              <w:right w:val="single" w:color="808080" w:sz="4"/>
+            </w:tcBorders>
+            <w:tcMar>
+              <w:top w:type="dxa" w:w="35"/>
+              <w:left w:type="dxa" w:w="90"/>
+              <w:bottom w:type="dxa" w:w="35"/>
+              <w:right w:type="dxa" w:w="90"/>
+            </w:tcMar>
+          </w:tcPr>
+          <w:p>
+            <w:pPr>
+              <w:spacing w:after="40" w:line="260"/>
+            </w:pPr>
+            <w:r>
+              <w:rPr>
+                <w:rFonts w:ascii="Times New Roman" w:cs="Times New Roman" w:eastAsia="Times New Roman" w:hAnsi="Times New Roman"/>
+                <w:sz w:val="19"/>
+                <w:szCs w:val="19"/>
+              </w:rPr>
+              <w:t xml:space="preserve">Ya</w:t>
+            </w:r>
+          </w:p>
+        </w:tc>
+        <w:tc>
+          <w:tcPr>
+            <w:tcW w:type="dxa" w:w="1372"/>
+            <w:tcBorders>
+              <w:top w:val="single" w:color="808080" w:sz="4"/>
+              <w:left w:val="single" w:color="808080" w:sz="4"/>
+              <w:bottom w:val="single" w:color="808080" w:sz="4"/>
+              <w:right w:val="single" w:color="808080" w:sz="4"/>
+            </w:tcBorders>
+            <w:tcMar>
+              <w:top w:type="dxa" w:w="35"/>
+              <w:left w:type="dxa" w:w="90"/>
+              <w:bottom w:type="dxa" w:w="35"/>
+              <w:right w:type="dxa" w:w="90"/>
+            </w:tcMar>
+          </w:tcPr>
+          <w:p>
+            <w:pPr>
+              <w:spacing w:after="40" w:line="260"/>
+            </w:pPr>
+            <w:r>
+              <w:rPr>
+                <w:rFonts w:ascii="Times New Roman" w:cs="Times New Roman" w:eastAsia="Times New Roman" w:hAnsi="Times New Roman"/>
+                <w:sz w:val="19"/>
+                <w:szCs w:val="19"/>
+              </w:rPr>
+              <w:t xml:space="preserve">Paket gratis</w:t>
+            </w:r>
+          </w:p>
+        </w:tc>
+      </w:tr>
+      <w:tr>
+        <w:trPr>
+          <w:cantSplit/>
+        </w:trPr>
+        <w:tc>
+          <w:tcPr>
+            <w:tcW w:type="dxa" w:w="2500"/>
+            <w:tcBorders>
+              <w:top w:val="single" w:color="808080" w:sz="4"/>
+              <w:left w:val="single" w:color="808080" w:sz="4"/>
+              <w:bottom w:val="single" w:color="808080" w:sz="4"/>
+              <w:right w:val="single" w:color="808080" w:sz="4"/>
+            </w:tcBorders>
+            <w:tcMar>
+              <w:top w:type="dxa" w:w="35"/>
+              <w:left w:type="dxa" w:w="90"/>
+              <w:bottom w:type="dxa" w:w="35"/>
+              <w:right w:type="dxa" w:w="90"/>
+            </w:tcMar>
+          </w:tcPr>
+          <w:p>
+            <w:pPr>
+              <w:spacing w:after="40" w:line="260"/>
+            </w:pPr>
+            <w:r>
+              <w:rPr>
+                <w:rFonts w:ascii="Times New Roman" w:cs="Times New Roman" w:eastAsia="Times New Roman" w:hAnsi="Times New Roman"/>
+                <w:sz w:val="19"/>
+                <w:szCs w:val="19"/>
+              </w:rPr>
+              <w:t xml:space="preserve">Netlify</w:t>
+            </w:r>
+          </w:p>
+        </w:tc>
+        <w:tc>
+          <w:tcPr>
+            <w:tcW w:type="dxa" w:w="3700"/>
+            <w:tcBorders>
+              <w:top w:val="single" w:color="808080" w:sz="4"/>
+              <w:left w:val="single" w:color="808080" w:sz="4"/>
+              <w:bottom w:val="single" w:color="808080" w:sz="4"/>
+              <w:right w:val="single" w:color="808080" w:sz="4"/>
+            </w:tcBorders>
+            <w:tcMar>
+              <w:top w:type="dxa" w:w="35"/>
+              <w:left w:type="dxa" w:w="90"/>
+              <w:bottom w:type="dxa" w:w="35"/>
+              <w:right w:type="dxa" w:w="90"/>
+            </w:tcMar>
+          </w:tcPr>
+          <w:p>
+            <w:pPr>
+              <w:spacing w:after="40" w:line="260"/>
+            </w:pPr>
+            <w:r>
+              <w:rPr>
+                <w:rFonts w:ascii="Times New Roman" w:cs="Times New Roman" w:eastAsia="Times New Roman" w:hAnsi="Times New Roman"/>
+                <w:sz w:val="19"/>
+                <w:szCs w:val="19"/>
+              </w:rPr>
+              <w:t xml:space="preserve">netlify.toml dan packages/app/public/_headers</w:t>
+            </w:r>
+          </w:p>
+        </w:tc>
+        <w:tc>
+          <w:tcPr>
+            <w:tcW w:type="dxa" w:w="1500"/>
+            <w:tcBorders>
+              <w:top w:val="single" w:color="808080" w:sz="4"/>
+              <w:left w:val="single" w:color="808080" w:sz="4"/>
+              <w:bottom w:val="single" w:color="808080" w:sz="4"/>
+              <w:right w:val="single" w:color="808080" w:sz="4"/>
+            </w:tcBorders>
+            <w:tcMar>
+              <w:top w:type="dxa" w:w="35"/>
+              <w:left w:type="dxa" w:w="90"/>
+              <w:bottom w:type="dxa" w:w="35"/>
+              <w:right w:type="dxa" w:w="90"/>
+            </w:tcMar>
+          </w:tcPr>
+          <w:p>
+            <w:pPr>
+              <w:spacing w:after="40" w:line="260"/>
+            </w:pPr>
+            <w:r>
+              <w:rPr>
+                <w:rFonts w:ascii="Times New Roman" w:cs="Times New Roman" w:eastAsia="Times New Roman" w:hAnsi="Times New Roman"/>
+                <w:sz w:val="19"/>
+                <w:szCs w:val="19"/>
+              </w:rPr>
+              <w:t xml:space="preserve">Ya</w:t>
+            </w:r>
+          </w:p>
+        </w:tc>
+        <w:tc>
+          <w:tcPr>
+            <w:tcW w:type="dxa" w:w="1372"/>
+            <w:tcBorders>
+              <w:top w:val="single" w:color="808080" w:sz="4"/>
+              <w:left w:val="single" w:color="808080" w:sz="4"/>
+              <w:bottom w:val="single" w:color="808080" w:sz="4"/>
+              <w:right w:val="single" w:color="808080" w:sz="4"/>
+            </w:tcBorders>
+            <w:tcMar>
+              <w:top w:type="dxa" w:w="35"/>
+              <w:left w:type="dxa" w:w="90"/>
+              <w:bottom w:type="dxa" w:w="35"/>
+              <w:right w:type="dxa" w:w="90"/>
+            </w:tcMar>
+          </w:tcPr>
+          <w:p>
+            <w:pPr>
+              <w:spacing w:after="40" w:line="260"/>
+            </w:pPr>
+            <w:r>
+              <w:rPr>
+                <w:rFonts w:ascii="Times New Roman" w:cs="Times New Roman" w:eastAsia="Times New Roman" w:hAnsi="Times New Roman"/>
+                <w:sz w:val="19"/>
+                <w:szCs w:val="19"/>
+              </w:rPr>
+              <w:t xml:space="preserve">Paket gratis</w:t>
+            </w:r>
+          </w:p>
+        </w:tc>
+      </w:tr>
+      <w:tr>
+        <w:trPr>
+          <w:cantSplit/>
+        </w:trPr>
+        <w:tc>
+          <w:tcPr>
+            <w:tcW w:type="dxa" w:w="2500"/>
+            <w:tcBorders>
+              <w:top w:val="single" w:color="808080" w:sz="4"/>
+              <w:left w:val="single" w:color="808080" w:sz="4"/>
+              <w:bottom w:val="single" w:color="808080" w:sz="4"/>
+              <w:right w:val="single" w:color="808080" w:sz="4"/>
+            </w:tcBorders>
+            <w:tcMar>
+              <w:top w:type="dxa" w:w="35"/>
+              <w:left w:type="dxa" w:w="90"/>
+              <w:bottom w:type="dxa" w:w="35"/>
+              <w:right w:type="dxa" w:w="90"/>
+            </w:tcMar>
+          </w:tcPr>
+          <w:p>
+            <w:pPr>
+              <w:spacing w:after="40" w:line="260"/>
+            </w:pPr>
+            <w:r>
+              <w:rPr>
+                <w:rFonts w:ascii="Times New Roman" w:cs="Times New Roman" w:eastAsia="Times New Roman" w:hAnsi="Times New Roman"/>
+                <w:sz w:val="19"/>
+                <w:szCs w:val="19"/>
+              </w:rPr>
+              <w:t xml:space="preserve">Cloudflare Pages</w:t>
+            </w:r>
+          </w:p>
+        </w:tc>
+        <w:tc>
+          <w:tcPr>
+            <w:tcW w:type="dxa" w:w="3700"/>
+            <w:tcBorders>
+              <w:top w:val="single" w:color="808080" w:sz="4"/>
+              <w:left w:val="single" w:color="808080" w:sz="4"/>
+              <w:bottom w:val="single" w:color="808080" w:sz="4"/>
+              <w:right w:val="single" w:color="808080" w:sz="4"/>
+            </w:tcBorders>
+            <w:tcMar>
+              <w:top w:type="dxa" w:w="35"/>
+              <w:left w:type="dxa" w:w="90"/>
+              <w:bottom w:type="dxa" w:w="35"/>
+              <w:right w:type="dxa" w:w="90"/>
+            </w:tcMar>
+          </w:tcPr>
+          <w:p>
+            <w:pPr>
+              <w:spacing w:after="40" w:line="260"/>
+            </w:pPr>
+            <w:r>
+              <w:rPr>
+                <w:rFonts w:ascii="Times New Roman" w:cs="Times New Roman" w:eastAsia="Times New Roman" w:hAnsi="Times New Roman"/>
+                <w:sz w:val="19"/>
+                <w:szCs w:val="19"/>
+              </w:rPr>
+              <w:t xml:space="preserve">wrangler.toml dan packages/app/public/_headers</w:t>
+            </w:r>
+          </w:p>
+        </w:tc>
+        <w:tc>
+          <w:tcPr>
+            <w:tcW w:type="dxa" w:w="1500"/>
+            <w:tcBorders>
+              <w:top w:val="single" w:color="808080" w:sz="4"/>
+              <w:left w:val="single" w:color="808080" w:sz="4"/>
+              <w:bottom w:val="single" w:color="808080" w:sz="4"/>
+              <w:right w:val="single" w:color="808080" w:sz="4"/>
+            </w:tcBorders>
+            <w:tcMar>
+              <w:top w:type="dxa" w:w="35"/>
+              <w:left w:type="dxa" w:w="90"/>
+              <w:bottom w:type="dxa" w:w="35"/>
+              <w:right w:type="dxa" w:w="90"/>
+            </w:tcMar>
+          </w:tcPr>
+          <w:p>
+            <w:pPr>
+              <w:spacing w:after="40" w:line="260"/>
+            </w:pPr>
+            <w:r>
+              <w:rPr>
+                <w:rFonts w:ascii="Times New Roman" w:cs="Times New Roman" w:eastAsia="Times New Roman" w:hAnsi="Times New Roman"/>
+                <w:sz w:val="19"/>
+                <w:szCs w:val="19"/>
+              </w:rPr>
+              <w:t xml:space="preserve">Ya</w:t>
+            </w:r>
+          </w:p>
+        </w:tc>
+        <w:tc>
+          <w:tcPr>
+            <w:tcW w:type="dxa" w:w="1372"/>
+            <w:tcBorders>
+              <w:top w:val="single" w:color="808080" w:sz="4"/>
+              <w:left w:val="single" w:color="808080" w:sz="4"/>
+              <w:bottom w:val="single" w:color="808080" w:sz="4"/>
+              <w:right w:val="single" w:color="808080" w:sz="4"/>
+            </w:tcBorders>
+            <w:tcMar>
+              <w:top w:type="dxa" w:w="35"/>
+              <w:left w:type="dxa" w:w="90"/>
+              <w:bottom w:type="dxa" w:w="35"/>
+              <w:right w:type="dxa" w:w="90"/>
+            </w:tcMar>
+          </w:tcPr>
+          <w:p>
+            <w:pPr>
+              <w:spacing w:after="40" w:line="260"/>
+            </w:pPr>
+            <w:r>
+              <w:rPr>
+                <w:rFonts w:ascii="Times New Roman" w:cs="Times New Roman" w:eastAsia="Times New Roman" w:hAnsi="Times New Roman"/>
+                <w:sz w:val="19"/>
+                <w:szCs w:val="19"/>
+              </w:rPr>
+              <w:t xml:space="preserve">Paket gratis</w:t>
+            </w:r>
+          </w:p>
+        </w:tc>
+      </w:tr>
+      <w:tr>
+        <w:trPr>
+          <w:cantSplit/>
+        </w:trPr>
+        <w:tc>
+          <w:tcPr>
+            <w:tcW w:type="dxa" w:w="2500"/>
+            <w:tcBorders>
+              <w:top w:val="single" w:color="808080" w:sz="4"/>
+              <w:left w:val="single" w:color="808080" w:sz="4"/>
+              <w:bottom w:val="single" w:color="808080" w:sz="4"/>
+              <w:right w:val="single" w:color="808080" w:sz="4"/>
+            </w:tcBorders>
+            <w:tcMar>
+              <w:top w:type="dxa" w:w="35"/>
+              <w:left w:type="dxa" w:w="90"/>
+              <w:bottom w:type="dxa" w:w="35"/>
+              <w:right w:type="dxa" w:w="90"/>
+            </w:tcMar>
+          </w:tcPr>
+          <w:p>
+            <w:pPr>
+              <w:spacing w:after="40" w:line="260"/>
+            </w:pPr>
+            <w:r>
+              <w:rPr>
+                <w:rFonts w:ascii="Times New Roman" w:cs="Times New Roman" w:eastAsia="Times New Roman" w:hAnsi="Times New Roman"/>
+                <w:sz w:val="19"/>
+                <w:szCs w:val="19"/>
+              </w:rPr>
+              <w:t xml:space="preserve">Firebase Hosting (Spark)</w:t>
+            </w:r>
+          </w:p>
+        </w:tc>
+        <w:tc>
+          <w:tcPr>
+            <w:tcW w:type="dxa" w:w="3700"/>
+            <w:tcBorders>
+              <w:top w:val="single" w:color="808080" w:sz="4"/>
+              <w:left w:val="single" w:color="808080" w:sz="4"/>
+              <w:bottom w:val="single" w:color="808080" w:sz="4"/>
+              <w:right w:val="single" w:color="808080" w:sz="4"/>
+            </w:tcBorders>
+            <w:tcMar>
+              <w:top w:type="dxa" w:w="35"/>
+              <w:left w:type="dxa" w:w="90"/>
+              <w:bottom w:type="dxa" w:w="35"/>
+              <w:right w:type="dxa" w:w="90"/>
+            </w:tcMar>
+          </w:tcPr>
+          <w:p>
+            <w:pPr>
+              <w:spacing w:after="40" w:line="260"/>
+            </w:pPr>
+            <w:r>
+              <w:rPr>
+                <w:rFonts w:ascii="Times New Roman" w:cs="Times New Roman" w:eastAsia="Times New Roman" w:hAnsi="Times New Roman"/>
+                <w:sz w:val="19"/>
+                <w:szCs w:val="19"/>
+              </w:rPr>
+              <w:t xml:space="preserve">firebase.json</w:t>
+            </w:r>
+          </w:p>
+        </w:tc>
+        <w:tc>
+          <w:tcPr>
+            <w:tcW w:type="dxa" w:w="1500"/>
+            <w:tcBorders>
+              <w:top w:val="single" w:color="808080" w:sz="4"/>
+              <w:left w:val="single" w:color="808080" w:sz="4"/>
+              <w:bottom w:val="single" w:color="808080" w:sz="4"/>
+              <w:right w:val="single" w:color="808080" w:sz="4"/>
+            </w:tcBorders>
+            <w:tcMar>
+              <w:top w:type="dxa" w:w="35"/>
+              <w:left w:type="dxa" w:w="90"/>
+              <w:bottom w:type="dxa" w:w="35"/>
+              <w:right w:type="dxa" w:w="90"/>
+            </w:tcMar>
+          </w:tcPr>
+          <w:p>
+            <w:pPr>
+              <w:spacing w:after="40" w:line="260"/>
+            </w:pPr>
+            <w:r>
+              <w:rPr>
+                <w:rFonts w:ascii="Times New Roman" w:cs="Times New Roman" w:eastAsia="Times New Roman" w:hAnsi="Times New Roman"/>
+                <w:sz w:val="19"/>
+                <w:szCs w:val="19"/>
+              </w:rPr>
+              <w:t xml:space="preserve">Ya</w:t>
+            </w:r>
+          </w:p>
+        </w:tc>
+        <w:tc>
+          <w:tcPr>
+            <w:tcW w:type="dxa" w:w="1372"/>
+            <w:tcBorders>
+              <w:top w:val="single" w:color="808080" w:sz="4"/>
+              <w:left w:val="single" w:color="808080" w:sz="4"/>
+              <w:bottom w:val="single" w:color="808080" w:sz="4"/>
+              <w:right w:val="single" w:color="808080" w:sz="4"/>
+            </w:tcBorders>
+            <w:tcMar>
+              <w:top w:type="dxa" w:w="35"/>
+              <w:left w:type="dxa" w:w="90"/>
+              <w:bottom w:type="dxa" w:w="35"/>
+              <w:right w:type="dxa" w:w="90"/>
+            </w:tcMar>
+          </w:tcPr>
+          <w:p>
+            <w:pPr>
+              <w:spacing w:after="40" w:line="260"/>
+            </w:pPr>
+            <w:r>
+              <w:rPr>
+                <w:rFonts w:ascii="Times New Roman" w:cs="Times New Roman" w:eastAsia="Times New Roman" w:hAnsi="Times New Roman"/>
+                <w:sz w:val="19"/>
+                <w:szCs w:val="19"/>
+              </w:rPr>
+              <w:t xml:space="preserve">Paket Spark</w:t>
+            </w:r>
+          </w:p>
+        </w:tc>
+      </w:tr>
+      <w:tr>
+        <w:trPr>
+          <w:cantSplit/>
+        </w:trPr>
+        <w:tc>
+          <w:tcPr>
+            <w:tcW w:type="dxa" w:w="2500"/>
+            <w:tcBorders>
+              <w:top w:val="single" w:color="808080" w:sz="4"/>
+              <w:left w:val="single" w:color="808080" w:sz="4"/>
+              <w:bottom w:val="single" w:color="808080" w:sz="4"/>
+              <w:right w:val="single" w:color="808080" w:sz="4"/>
+            </w:tcBorders>
+            <w:tcMar>
+              <w:top w:type="dxa" w:w="35"/>
+              <w:left w:type="dxa" w:w="90"/>
+              <w:bottom w:type="dxa" w:w="35"/>
+              <w:right w:type="dxa" w:w="90"/>
+            </w:tcMar>
+          </w:tcPr>
+          <w:p>
+            <w:pPr>
+              <w:spacing w:after="40" w:line="260"/>
+            </w:pPr>
+            <w:r>
+              <w:rPr>
+                <w:rFonts w:ascii="Times New Roman" w:cs="Times New Roman" w:eastAsia="Times New Roman" w:hAnsi="Times New Roman"/>
+                <w:sz w:val="19"/>
+                <w:szCs w:val="19"/>
+              </w:rPr>
+              <w:t xml:space="preserve">Hugging Face Spaces (statis)</w:t>
+            </w:r>
+          </w:p>
+        </w:tc>
+        <w:tc>
+          <w:tcPr>
+            <w:tcW w:type="dxa" w:w="3700"/>
+            <w:tcBorders>
+              <w:top w:val="single" w:color="808080" w:sz="4"/>
+              <w:left w:val="single" w:color="808080" w:sz="4"/>
+              <w:bottom w:val="single" w:color="808080" w:sz="4"/>
+              <w:right w:val="single" w:color="808080" w:sz="4"/>
+            </w:tcBorders>
+            <w:tcMar>
+              <w:top w:type="dxa" w:w="35"/>
+              <w:left w:type="dxa" w:w="90"/>
+              <w:bottom w:type="dxa" w:w="35"/>
+              <w:right w:type="dxa" w:w="90"/>
+            </w:tcMar>
+          </w:tcPr>
+          <w:p>
+            <w:pPr>
+              <w:spacing w:after="40" w:line="260"/>
+            </w:pPr>
+            <w:r>
+              <w:rPr>
+                <w:rFonts w:ascii="Times New Roman" w:cs="Times New Roman" w:eastAsia="Times New Roman" w:hAnsi="Times New Roman"/>
+                <w:sz w:val="19"/>
+                <w:szCs w:val="19"/>
+              </w:rPr>
+              <w:t xml:space="preserve">deploy/huggingface/README.md</w:t>
+            </w:r>
+          </w:p>
+        </w:tc>
+        <w:tc>
+          <w:tcPr>
+            <w:tcW w:type="dxa" w:w="1500"/>
+            <w:tcBorders>
+              <w:top w:val="single" w:color="808080" w:sz="4"/>
+              <w:left w:val="single" w:color="808080" w:sz="4"/>
+              <w:bottom w:val="single" w:color="808080" w:sz="4"/>
+              <w:right w:val="single" w:color="808080" w:sz="4"/>
+            </w:tcBorders>
+            <w:tcMar>
+              <w:top w:type="dxa" w:w="35"/>
+              <w:left w:type="dxa" w:w="90"/>
+              <w:bottom w:type="dxa" w:w="35"/>
+              <w:right w:type="dxa" w:w="90"/>
+            </w:tcMar>
+          </w:tcPr>
+          <w:p>
+            <w:pPr>
+              <w:spacing w:after="40" w:line="260"/>
+            </w:pPr>
+            <w:r>
+              <w:rPr>
+                <w:rFonts w:ascii="Times New Roman" w:cs="Times New Roman" w:eastAsia="Times New Roman" w:hAnsi="Times New Roman"/>
+                <w:sz w:val="19"/>
+                <w:szCs w:val="19"/>
+              </w:rPr>
+              <w:t xml:space="preserve">Tidak</w:t>
+            </w:r>
+          </w:p>
+        </w:tc>
+        <w:tc>
+          <w:tcPr>
+            <w:tcW w:type="dxa" w:w="1372"/>
+            <w:tcBorders>
+              <w:top w:val="single" w:color="808080" w:sz="4"/>
+              <w:left w:val="single" w:color="808080" w:sz="4"/>
+              <w:bottom w:val="single" w:color="808080" w:sz="4"/>
+              <w:right w:val="single" w:color="808080" w:sz="4"/>
+            </w:tcBorders>
+            <w:tcMar>
+              <w:top w:type="dxa" w:w="35"/>
+              <w:left w:type="dxa" w:w="90"/>
+              <w:bottom w:type="dxa" w:w="35"/>
+              <w:right w:type="dxa" w:w="90"/>
+            </w:tcMar>
+          </w:tcPr>
+          <w:p>
+            <w:pPr>
+              <w:spacing w:after="40" w:line="260"/>
+            </w:pPr>
+            <w:r>
+              <w:rPr>
+                <w:rFonts w:ascii="Times New Roman" w:cs="Times New Roman" w:eastAsia="Times New Roman" w:hAnsi="Times New Roman"/>
+                <w:sz w:val="19"/>
+                <w:szCs w:val="19"/>
+              </w:rPr>
+              <w:t xml:space="preserve">Gratis</w:t>
+            </w:r>
+          </w:p>
+        </w:tc>
+      </w:tr>
+    </w:tbl>
+    <w:p>
+      <w:pPr>
+        <w:spacing w:after="60" w:line="200"/>
+      </w:pPr>
+    </w:p>
+    <w:p>
+      <w:pPr>
+        <w:spacing w:after="100" w:line="252"/>
+        <w:jc w:val="both"/>
+      </w:pPr>
+      <w:r>
+        <w:rPr>
+          <w:rFonts w:ascii="Times New Roman" w:cs="Times New Roman" w:eastAsia="Times New Roman" w:hAnsi="Times New Roman"/>
+          <w:sz w:val="22"/>
+          <w:szCs w:val="22"/>
+        </w:rPr>
+        <w:t xml:space="preserve">Kolom "Header nyata" menunjukkan apakah platform mengirim header keamanan buatan sendiri. Pada GitHub Pages dan Hugging Face kebijakan hanya dapat diberikan lewat tag meta, yang tidak dapat memuat frame-ancestors, sehingga halaman dapat dibenamkan pada situs lain. Pada empat platform lainnya header sungguhan dikirim dan pembenaman ditolak. Isi kebijakannya sama persis di semua tempat, dan sebuah uji otomatis menjaga agar tidak ada salinan yang berselisih.</w:t>
+      </w:r>
+    </w:p>
+    <w:p>
+      <w:pPr>
+        <w:spacing w:after="100" w:line="252"/>
+        <w:jc w:val="both"/>
+      </w:pPr>
+      <w:r>
+        <w:rPr>
+          <w:rFonts w:ascii="Times New Roman" w:cs="Times New Roman" w:eastAsia="Times New Roman" w:hAnsi="Times New Roman"/>
+          <w:sz w:val="22"/>
+          <w:szCs w:val="22"/>
+        </w:rPr>
+        <w:t xml:space="preserve">Langkah rinci per platform ada pada berkas deploy/README.md di repositori. Menyebarkan memerlukan akun Anda pada platform yang bersangkutan, sehingga bagian itu hanya dapat Anda kerjakan: hubungkan repositori, atau jalankan perintah penyebaran platform tersebut.</w:t>
+      </w:r>
+    </w:p>
+    <w:p>
+      <w:pPr>
+        <w:pStyle w:val="Heading2"/>
+      </w:pPr>
+      <w:r>
+        <w:rPr>
+          <w:rFonts w:ascii="Times New Roman" w:cs="Times New Roman" w:eastAsia="Times New Roman" w:hAnsi="Times New Roman"/>
+        </w:rPr>
+        <w:t xml:space="preserve">12.1 Yang sengaja tidak disambungkan</w:t>
+      </w:r>
+    </w:p>
+    <w:p>
+      <w:pPr>
+        <w:spacing w:after="100" w:line="252"/>
+        <w:jc w:val="both"/>
+      </w:pPr>
+      <w:r>
+        <w:rPr>
+          <w:rFonts w:ascii="Times New Roman" w:cs="Times New Roman" w:eastAsia="Times New Roman" w:hAnsi="Times New Roman"/>
+          <w:sz w:val="22"/>
+          <w:szCs w:val="22"/>
+        </w:rPr>
+        <w:t xml:space="preserve">Supabase, Firestore, serta D1, R2, dan KV pada Cloudflare adalah penyimpanan data di peladen, bukan hosting. Tidak satu pun disambungkan, karena menyambungkannya membalik tiga janji yang diuji: nol permintaan keluar, data tinggal di perangkat pengguna, dan tanpa akun. Ia juga mengharuskan kebijakan connect-src dilonggarkan, menambah kunci dan aturan akses sebagai permukaan serangan baru, dan tidak dapat dibuktikan benar tanpa akun milik Anda.</w:t>
+      </w:r>
+    </w:p>
+    <w:p>
+      <w:pPr>
+        <w:spacing w:after="100" w:line="252"/>
+        <w:jc w:val="both"/>
+      </w:pPr>
+      <w:r>
+        <w:rPr>
+          <w:rFonts w:ascii="Times New Roman" w:cs="Times New Roman" w:eastAsia="Times New Roman" w:hAnsi="Times New Roman"/>
+          <w:sz w:val="22"/>
+          <w:szCs w:val="22"/>
+        </w:rPr>
+        <w:t xml:space="preserve">Antarmuka penyimpanan sudah memungkinkan penyesuai keempat bila kelak dikehendaki. Keputusannya ada pada Anda: apakah Anda menghendaki penyimpanan peladen yang dipilih sendiri oleh pengguna, dan layanan mana. Glitch tidak dimasukkan karena, menurut yang saya ketahui, layanan hostingnya dihentikan pada 2025. Periksa status terbarunya.</w:t>
+      </w:r>
+    </w:p>
+    <w:p>
+      <w:pPr>
+        <w:pStyle w:val="Heading2"/>
+      </w:pPr>
+      <w:r>
+        <w:rPr>
+          <w:rFonts w:ascii="Times New Roman" w:cs="Times New Roman" w:eastAsia="Times New Roman" w:hAnsi="Times New Roman"/>
+        </w:rPr>
+        <w:t xml:space="preserve">12.2 Berkas jalankan desktop dan WebView2</w:t>
+      </w:r>
+    </w:p>
+    <w:p>
+      <w:pPr>
+        <w:spacing w:after="100" w:line="252"/>
+        <w:jc w:val="both"/>
+      </w:pPr>
+      <w:r>
+        <w:rPr>
+          <w:rFonts w:ascii="Times New Roman" w:cs="Times New Roman" w:eastAsia="Times New Roman" w:hAnsi="Times New Roman"/>
+          <w:sz w:val="22"/>
+          <w:szCs w:val="22"/>
+        </w:rPr>
+        <w:t xml:space="preserve">Berkas .exe portabel membutuhkan komponen WebView2. Windows 11 dan Windows 10 yang diperbarui sudah memilikinya. Bila belum, berkas jalankan menampilkan pesan dengan tautan pemasangan resmi dari Microsoft. Berkas pada rilis v0.2.0 telah diperiksa secara statis (hash sama dengan yang dicatat GitHub, format PE x64 bersubsistem GUI dengan ASLR dan DEP, tidak merujuk DLL jaringan), tetapi belum dijalankan pada Windows. Itulah langkah pertama pada bab 5.</w:t>
+      </w:r>
+    </w:p>
     <w:p>
       <w:pPr>
         <w:pStyle w:val="Heading1"/>

</xml_diff>